<commit_message>
Protect main.py startup_event from crashing on DB init to eliminate 502 Bad Gateway
</commit_message>
<xml_diff>
--- a/credentials.docx
+++ b/credentials.docx
@@ -335,6 +335,7 @@
                 <w:szCs w:val="24"/>
               </w:rPr>
             </w:pPr>
+            <w:bookmarkStart w:id="0" w:name="_Hlk238845087"/>
             <w:r>
               <w:rPr>
                 <w:rFonts w:ascii="Times New Roman" w:eastAsia="Times New Roman" w:hAnsi="Times New Roman" w:cs="Times New Roman"/>
@@ -1344,6 +1345,7 @@
         </w:tc>
       </w:tr>
     </w:tbl>
+    <w:bookmarkEnd w:id="0"/>
     <w:p>
       <w:pPr>
         <w:spacing w:after="0" w:line="240" w:lineRule="auto"/>
@@ -2221,6 +2223,8 @@
         </w:rPr>
         <w:t>: </w:t>
       </w:r>
+      <w:bookmarkStart w:id="1" w:name="OLE_LINK3"/>
+      <w:bookmarkStart w:id="2" w:name="OLE_LINK4"/>
       <w:r>
         <w:rPr>
           <w:rFonts w:ascii="Consolas" w:eastAsia="Times New Roman" w:hAnsi="Consolas" w:cs="Courier New"/>
@@ -2230,6 +2234,8 @@
         <w:t>https://ai-hotel-backend-rfhl.onrender.com</w:t>
       </w:r>
     </w:p>
+    <w:bookmarkEnd w:id="1"/>
+    <w:bookmarkEnd w:id="2"/>
     <w:p>
       <w:pPr>
         <w:numPr>

</xml_diff>